<commit_message>
more changes to the configure output table feature
</commit_message>
<xml_diff>
--- a/Manual/Short_ICP-Base_Manual.docx
+++ b/Manual/Short_ICP-Base_Manual.docx
@@ -4702,7 +4702,25 @@
         <w:rPr>
           <w:lang w:val="en-US"/>
         </w:rPr>
-        <w:t>Raw results</w:t>
+        <w:t>All</w:t>
+      </w:r>
+      <w:r>
+        <w:rPr>
+          <w:lang w:val="en-US"/>
+        </w:rPr>
+        <w:t xml:space="preserve"> </w:t>
+      </w:r>
+      <w:r>
+        <w:rPr>
+          <w:lang w:val="en-US"/>
+        </w:rPr>
+        <w:t>R</w:t>
+      </w:r>
+      <w:r>
+        <w:rPr>
+          <w:lang w:val="en-US"/>
+        </w:rPr>
+        <w:t>esults</w:t>
       </w:r>
     </w:p>
     <w:p>
@@ -4756,7 +4774,7 @@
         <w:rPr>
           <w:lang w:val="en-US"/>
         </w:rPr>
-        <w:t>Mass fractions unfiltered (without detection limits)</w:t>
+        <w:t>CPS</w:t>
       </w:r>
     </w:p>
     <w:p>
@@ -4774,7 +4792,43 @@
         <w:rPr>
           <w:lang w:val="en-US"/>
         </w:rPr>
-        <w:t>Sensitivities</w:t>
+        <w:t>And more</w:t>
+      </w:r>
+    </w:p>
+    <w:p>
+      <w:pPr>
+        <w:pStyle w:val="ListParagraph"/>
+        <w:numPr>
+          <w:ilvl w:val="1"/>
+          <w:numId w:val="12"/>
+        </w:numPr>
+        <w:rPr>
+          <w:lang w:val="en-US"/>
+        </w:rPr>
+      </w:pPr>
+      <w:r>
+        <w:rPr>
+          <w:lang w:val="en-US"/>
+        </w:rPr>
+        <w:t>Change to “Inclusion” to see results for inclusion</w:t>
+      </w:r>
+    </w:p>
+    <w:p>
+      <w:pPr>
+        <w:pStyle w:val="ListParagraph"/>
+        <w:numPr>
+          <w:ilvl w:val="1"/>
+          <w:numId w:val="12"/>
+        </w:numPr>
+        <w:rPr>
+          <w:lang w:val="en-US"/>
+        </w:rPr>
+      </w:pPr>
+      <w:r>
+        <w:rPr>
+          <w:lang w:val="en-US"/>
+        </w:rPr>
+        <w:t>Create an output table</w:t>
       </w:r>
     </w:p>
     <w:p>
@@ -4792,7 +4846,7 @@
         <w:rPr>
           <w:lang w:val="en-US"/>
         </w:rPr>
-        <w:t>CPS</w:t>
+        <w:t>It will always output the table that you are currently looking at</w:t>
       </w:r>
     </w:p>
     <w:p>
@@ -4810,7 +4864,25 @@
         <w:rPr>
           <w:lang w:val="en-US"/>
         </w:rPr>
-        <w:t>And more</w:t>
+        <w:t>Right-click the button to output the mass fractions for all PRM – bracket id pairs</w:t>
+      </w:r>
+    </w:p>
+    <w:p>
+      <w:pPr>
+        <w:pStyle w:val="ListParagraph"/>
+        <w:numPr>
+          <w:ilvl w:val="0"/>
+          <w:numId w:val="12"/>
+        </w:numPr>
+        <w:rPr>
+          <w:lang w:val="en-US"/>
+        </w:rPr>
+      </w:pPr>
+      <w:r>
+        <w:rPr>
+          <w:lang w:val="en-US"/>
+        </w:rPr>
+        <w:t>Add Metadata</w:t>
       </w:r>
     </w:p>
     <w:p>
@@ -4828,7 +4900,13 @@
         <w:rPr>
           <w:lang w:val="en-US"/>
         </w:rPr>
-        <w:t>Change to “Inclusion” to see results for inclusion</w:t>
+        <w:t xml:space="preserve">Add sample names and materials </w:t>
+      </w:r>
+      <w:r>
+        <w:rPr>
+          <w:lang w:val="en-US"/>
+        </w:rPr>
+        <w:t>and location</w:t>
       </w:r>
     </w:p>
     <w:p>
@@ -4846,7 +4924,43 @@
         <w:rPr>
           <w:lang w:val="en-US"/>
         </w:rPr>
-        <w:t>Create an output table</w:t>
+        <w:t>Add custom columns (numeric or text)</w:t>
+      </w:r>
+    </w:p>
+    <w:p>
+      <w:pPr>
+        <w:pStyle w:val="ListParagraph"/>
+        <w:numPr>
+          <w:ilvl w:val="0"/>
+          <w:numId w:val="12"/>
+        </w:numPr>
+        <w:rPr>
+          <w:lang w:val="en-US"/>
+        </w:rPr>
+      </w:pPr>
+      <w:r>
+        <w:rPr>
+          <w:lang w:val="en-US"/>
+        </w:rPr>
+        <w:t>Quality Control</w:t>
+      </w:r>
+    </w:p>
+    <w:p>
+      <w:pPr>
+        <w:pStyle w:val="ListParagraph"/>
+        <w:numPr>
+          <w:ilvl w:val="1"/>
+          <w:numId w:val="12"/>
+        </w:numPr>
+        <w:rPr>
+          <w:lang w:val="en-US"/>
+        </w:rPr>
+      </w:pPr>
+      <w:r>
+        <w:rPr>
+          <w:lang w:val="en-US"/>
+        </w:rPr>
+        <w:t>Secondary Reference Material</w:t>
       </w:r>
     </w:p>
     <w:p>
@@ -4864,7 +4978,25 @@
         <w:rPr>
           <w:lang w:val="en-US"/>
         </w:rPr>
-        <w:t>It will always output the table that you are currently looking at</w:t>
+        <w:t>Ratios the results of a secondary reference material  by its “Real Value” which comes from the reference material file (.csv in RM_Files folder)</w:t>
+      </w:r>
+    </w:p>
+    <w:p>
+      <w:pPr>
+        <w:pStyle w:val="ListParagraph"/>
+        <w:numPr>
+          <w:ilvl w:val="1"/>
+          <w:numId w:val="12"/>
+        </w:numPr>
+        <w:rPr>
+          <w:lang w:val="en-US"/>
+        </w:rPr>
+      </w:pPr>
+      <w:r>
+        <w:rPr>
+          <w:lang w:val="en-US"/>
+        </w:rPr>
+        <w:t xml:space="preserve">Matrix sensitivity factor </w:t>
       </w:r>
     </w:p>
     <w:p>
@@ -4882,7 +5014,7 @@
         <w:rPr>
           <w:lang w:val="en-US"/>
         </w:rPr>
-        <w:t>Right-click the button to output the mass fractions for all PRM – bracket id pairs</w:t>
+        <w:t>Same as in the Quantification Module, read it up there</w:t>
       </w:r>
     </w:p>
     <w:p>
@@ -4900,7 +5032,7 @@
         <w:rPr>
           <w:lang w:val="en-US"/>
         </w:rPr>
-        <w:t>Add Metadata</w:t>
+        <w:t>Configure Output Table</w:t>
       </w:r>
     </w:p>
     <w:p>
@@ -4918,13 +5050,7 @@
         <w:rPr>
           <w:lang w:val="en-US"/>
         </w:rPr>
-        <w:t xml:space="preserve">Add sample names and materials </w:t>
-      </w:r>
-      <w:r>
-        <w:rPr>
-          <w:lang w:val="en-US"/>
-        </w:rPr>
-        <w:t>and location</w:t>
+        <w:t>Assign Analytes to Calibrators</w:t>
       </w:r>
     </w:p>
     <w:p>
@@ -4942,169 +5068,7 @@
         <w:rPr>
           <w:lang w:val="en-US"/>
         </w:rPr>
-        <w:t>Add custom columns (numeric or text)</w:t>
-      </w:r>
-    </w:p>
-    <w:p>
-      <w:pPr>
-        <w:pStyle w:val="ListParagraph"/>
-        <w:numPr>
-          <w:ilvl w:val="0"/>
-          <w:numId w:val="12"/>
-        </w:numPr>
-        <w:rPr>
-          <w:lang w:val="en-US"/>
-        </w:rPr>
-      </w:pPr>
-      <w:r>
-        <w:rPr>
-          <w:lang w:val="en-US"/>
-        </w:rPr>
-        <w:t>Quality Control</w:t>
-      </w:r>
-    </w:p>
-    <w:p>
-      <w:pPr>
-        <w:pStyle w:val="ListParagraph"/>
-        <w:numPr>
-          <w:ilvl w:val="1"/>
-          <w:numId w:val="12"/>
-        </w:numPr>
-        <w:rPr>
-          <w:lang w:val="en-US"/>
-        </w:rPr>
-      </w:pPr>
-      <w:r>
-        <w:rPr>
-          <w:lang w:val="en-US"/>
-        </w:rPr>
-        <w:t>Secondary Reference Material</w:t>
-      </w:r>
-    </w:p>
-    <w:p>
-      <w:pPr>
-        <w:pStyle w:val="ListParagraph"/>
-        <w:numPr>
-          <w:ilvl w:val="2"/>
-          <w:numId w:val="12"/>
-        </w:numPr>
-        <w:rPr>
-          <w:lang w:val="en-US"/>
-        </w:rPr>
-      </w:pPr>
-      <w:r>
-        <w:rPr>
-          <w:lang w:val="en-US"/>
-        </w:rPr>
-        <w:t>Ratios the results of a secondary reference material  by its “Real Value” which comes from the reference material file (.csv in RM_Files folder)</w:t>
-      </w:r>
-    </w:p>
-    <w:p>
-      <w:pPr>
-        <w:pStyle w:val="ListParagraph"/>
-        <w:numPr>
-          <w:ilvl w:val="1"/>
-          <w:numId w:val="12"/>
-        </w:numPr>
-        <w:rPr>
-          <w:lang w:val="en-US"/>
-        </w:rPr>
-      </w:pPr>
-      <w:r>
-        <w:rPr>
-          <w:lang w:val="en-US"/>
-        </w:rPr>
-        <w:t xml:space="preserve">Matrix sensitivity factor </w:t>
-      </w:r>
-    </w:p>
-    <w:p>
-      <w:pPr>
-        <w:pStyle w:val="ListParagraph"/>
-        <w:numPr>
-          <w:ilvl w:val="2"/>
-          <w:numId w:val="12"/>
-        </w:numPr>
-        <w:rPr>
-          <w:lang w:val="en-US"/>
-        </w:rPr>
-      </w:pPr>
-      <w:r>
-        <w:rPr>
-          <w:lang w:val="en-US"/>
-        </w:rPr>
-        <w:t>Same as in the Quantification Module, read it up there</w:t>
-      </w:r>
-    </w:p>
-    <w:p>
-      <w:pPr>
-        <w:pStyle w:val="ListParagraph"/>
-        <w:numPr>
-          <w:ilvl w:val="1"/>
-          <w:numId w:val="12"/>
-        </w:numPr>
-        <w:rPr>
-          <w:lang w:val="en-US"/>
-        </w:rPr>
-      </w:pPr>
-      <w:r>
-        <w:rPr>
-          <w:lang w:val="en-US"/>
-        </w:rPr>
-        <w:t>Session Drift</w:t>
-      </w:r>
-    </w:p>
-    <w:p>
-      <w:pPr>
-        <w:pStyle w:val="ListParagraph"/>
-        <w:numPr>
-          <w:ilvl w:val="2"/>
-          <w:numId w:val="12"/>
-        </w:numPr>
-        <w:rPr>
-          <w:lang w:val="en-US"/>
-        </w:rPr>
-      </w:pPr>
-      <w:r>
-        <w:rPr>
-          <w:lang w:val="en-US"/>
-        </w:rPr>
-        <w:t>Shows the results over the time of the session</w:t>
-      </w:r>
-    </w:p>
-    <w:p>
-      <w:pPr>
-        <w:pStyle w:val="ListParagraph"/>
-        <w:numPr>
-          <w:ilvl w:val="2"/>
-          <w:numId w:val="12"/>
-        </w:numPr>
-        <w:rPr>
-          <w:lang w:val="en-US"/>
-        </w:rPr>
-      </w:pPr>
-      <w:r>
-        <w:rPr>
-          <w:lang w:val="en-US"/>
-        </w:rPr>
-        <w:t>For secondary reference materials there is a black dashed line to show the “real value”</w:t>
-      </w:r>
-    </w:p>
-    <w:p>
-      <w:pPr>
-        <w:pStyle w:val="ListParagraph"/>
-        <w:numPr>
-          <w:ilvl w:val="2"/>
-          <w:numId w:val="12"/>
-        </w:numPr>
-        <w:rPr>
-          <w:lang w:val="en-US"/>
-        </w:rPr>
-      </w:pPr>
-      <w:r>
-        <w:rPr>
-          <w:lang w:val="en-US"/>
-        </w:rPr>
-        <w:t>Grey dashed lines show that there were some other spots measured in between</w:t>
+        <w:t>Export table or send to VisModule</w:t>
       </w:r>
     </w:p>
     <w:p>
@@ -5168,7 +5132,23 @@
           <w:bCs/>
           <w:lang w:val="en-US"/>
         </w:rPr>
-        <w:t>Evaluated the SRMs,</w:t>
+        <w:t>Evaluated the SRMs</w:t>
+      </w:r>
+      <w:r>
+        <w:rPr>
+          <w:b/>
+          <w:bCs/>
+          <w:lang w:val="en-US"/>
+        </w:rPr>
+        <w:t xml:space="preserve"> (optional)</w:t>
+      </w:r>
+      <w:r>
+        <w:rPr>
+          <w:b/>
+          <w:bCs/>
+          <w:lang w:val="en-US"/>
+        </w:rPr>
+        <w:t>,</w:t>
       </w:r>
     </w:p>
     <w:p>
@@ -5214,7 +5194,7 @@
           <w:bCs/>
           <w:lang w:val="en-US"/>
         </w:rPr>
-        <w:t>Created output tables</w:t>
+        <w:t>Configured the output table and exported the data (optional)</w:t>
       </w:r>
     </w:p>
     <w:p>

</xml_diff>

<commit_message>
More assigned table changes
</commit_message>
<xml_diff>
--- a/Manual/Short_ICP-Base_Manual.docx
+++ b/Manual/Short_ICP-Base_Manual.docx
@@ -749,7 +749,21 @@
         <w:rPr>
           <w:lang w:val="en-US"/>
         </w:rPr>
-        <w:t xml:space="preserve"> etc)</w:t>
+        <w:t xml:space="preserve"> </w:t>
+      </w:r>
+      <w:proofErr w:type="spellStart"/>
+      <w:r>
+        <w:rPr>
+          <w:lang w:val="en-US"/>
+        </w:rPr>
+        <w:t>etc</w:t>
+      </w:r>
+      <w:proofErr w:type="spellEnd"/>
+      <w:r>
+        <w:rPr>
+          <w:lang w:val="en-US"/>
+        </w:rPr>
+        <w:t>)</w:t>
       </w:r>
     </w:p>
     <w:p>
@@ -812,7 +826,19 @@
         <w:rPr>
           <w:lang w:val="en-US"/>
         </w:rPr>
-        <w:t>Proceed to VisModule</w:t>
+        <w:t xml:space="preserve">Proceed to </w:t>
+      </w:r>
+      <w:r>
+        <w:rPr>
+          <w:lang w:val="en-US"/>
+        </w:rPr>
+        <w:t xml:space="preserve">Table Builder &amp; </w:t>
+      </w:r>
+      <w:r>
+        <w:rPr>
+          <w:lang w:val="en-US"/>
+        </w:rPr>
+        <w:t>VisModule</w:t>
       </w:r>
     </w:p>
     <w:p>
@@ -839,12 +865,18 @@
         </w:rPr>
         <w:t>to visualize</w:t>
       </w:r>
-    </w:p>
-    <w:p>
-      <w:pPr>
-        <w:pStyle w:val="ListParagraph"/>
-        <w:numPr>
-          <w:ilvl w:val="2"/>
+      <w:r>
+        <w:rPr>
+          <w:lang w:val="en-US"/>
+        </w:rPr>
+        <w:t xml:space="preserve"> in VisModule</w:t>
+      </w:r>
+    </w:p>
+    <w:p>
+      <w:pPr>
+        <w:pStyle w:val="ListParagraph"/>
+        <w:numPr>
+          <w:ilvl w:val="1"/>
           <w:numId w:val="6"/>
         </w:numPr>
         <w:jc w:val="both"/>
@@ -856,7 +888,19 @@
         <w:rPr>
           <w:lang w:val="en-US"/>
         </w:rPr>
-        <w:t>Optionally export the table as .xlsx or .mat (right-click the button)</w:t>
+        <w:t>O</w:t>
+      </w:r>
+      <w:r>
+        <w:rPr>
+          <w:lang w:val="en-US"/>
+        </w:rPr>
+        <w:t>r e</w:t>
+      </w:r>
+      <w:r>
+        <w:rPr>
+          <w:lang w:val="en-US"/>
+        </w:rPr>
+        <w:t>xport the table as .xlsx or .mat (right-click the button)</w:t>
       </w:r>
     </w:p>
     <w:p>
@@ -1114,7 +1158,21 @@
         <w:rPr>
           <w:lang w:val="en-US"/>
         </w:rPr>
-        <w:t xml:space="preserve">and Nexion .csv </w:t>
+        <w:t xml:space="preserve">and </w:t>
+      </w:r>
+      <w:proofErr w:type="spellStart"/>
+      <w:r>
+        <w:rPr>
+          <w:lang w:val="en-US"/>
+        </w:rPr>
+        <w:t>Nexion</w:t>
+      </w:r>
+      <w:proofErr w:type="spellEnd"/>
+      <w:r>
+        <w:rPr>
+          <w:lang w:val="en-US"/>
+        </w:rPr>
+        <w:t xml:space="preserve"> .csv </w:t>
       </w:r>
       <w:r>
         <w:rPr>
@@ -1557,7 +1615,21 @@
         <w:rPr>
           <w:lang w:val="en-US"/>
         </w:rPr>
-        <w:t>Thermo Fisher iCAP they are already imported with the signal data.</w:t>
+        <w:t xml:space="preserve">Thermo Fisher </w:t>
+      </w:r>
+      <w:proofErr w:type="spellStart"/>
+      <w:r>
+        <w:rPr>
+          <w:lang w:val="en-US"/>
+        </w:rPr>
+        <w:t>iCAP</w:t>
+      </w:r>
+      <w:proofErr w:type="spellEnd"/>
+      <w:r>
+        <w:rPr>
+          <w:lang w:val="en-US"/>
+        </w:rPr>
+        <w:t xml:space="preserve"> they are already imported with the signal data.</w:t>
       </w:r>
     </w:p>
     <w:p>
@@ -1588,8 +1660,16 @@
         <w:rPr>
           <w:lang w:val="en-US"/>
         </w:rPr>
-        <w:t>times are imported, ICP-Base assumes 10 ms</w:t>
-      </w:r>
+        <w:t xml:space="preserve">times are imported, ICP-Base assumes 10 </w:t>
+      </w:r>
+      <w:proofErr w:type="spellStart"/>
+      <w:r>
+        <w:rPr>
+          <w:lang w:val="en-US"/>
+        </w:rPr>
+        <w:t>ms</w:t>
+      </w:r>
+      <w:proofErr w:type="spellEnd"/>
     </w:p>
     <w:p>
       <w:pPr>
@@ -1664,7 +1744,21 @@
         <w:rPr>
           <w:lang w:val="en-US"/>
         </w:rPr>
-        <w:t xml:space="preserve">Thermo Fisher iCAP </w:t>
+        <w:t xml:space="preserve">Thermo Fisher </w:t>
+      </w:r>
+      <w:proofErr w:type="spellStart"/>
+      <w:r>
+        <w:rPr>
+          <w:lang w:val="en-US"/>
+        </w:rPr>
+        <w:t>iCAP</w:t>
+      </w:r>
+      <w:proofErr w:type="spellEnd"/>
+      <w:r>
+        <w:rPr>
+          <w:lang w:val="en-US"/>
+        </w:rPr>
+        <w:t xml:space="preserve"> </w:t>
       </w:r>
       <w:r>
         <w:rPr>
@@ -3298,7 +3392,21 @@
         <w:rPr>
           <w:lang w:val="en-US"/>
         </w:rPr>
-        <w:t>Their compositions are stored in files in the subfolder RM_Files in the ICP-Base folder</w:t>
+        <w:t xml:space="preserve">Their compositions are stored in files in the subfolder </w:t>
+      </w:r>
+      <w:proofErr w:type="spellStart"/>
+      <w:r>
+        <w:rPr>
+          <w:lang w:val="en-US"/>
+        </w:rPr>
+        <w:t>RM_Files</w:t>
+      </w:r>
+      <w:proofErr w:type="spellEnd"/>
+      <w:r>
+        <w:rPr>
+          <w:lang w:val="en-US"/>
+        </w:rPr>
+        <w:t xml:space="preserve"> in the ICP-Base folder</w:t>
       </w:r>
       <w:r>
         <w:rPr>
@@ -3310,7 +3418,21 @@
         <w:rPr>
           <w:lang w:val="en-US"/>
         </w:rPr>
-        <w:t xml:space="preserve"> or in a custom set filepath (changed via the settings menu).</w:t>
+        <w:t xml:space="preserve"> or in a custom set </w:t>
+      </w:r>
+      <w:proofErr w:type="spellStart"/>
+      <w:r>
+        <w:rPr>
+          <w:lang w:val="en-US"/>
+        </w:rPr>
+        <w:t>filepath</w:t>
+      </w:r>
+      <w:proofErr w:type="spellEnd"/>
+      <w:r>
+        <w:rPr>
+          <w:lang w:val="en-US"/>
+        </w:rPr>
+        <w:t xml:space="preserve"> (changed via the settings menu).</w:t>
       </w:r>
     </w:p>
     <w:p>
@@ -4081,7 +4203,21 @@
         <w:rPr>
           <w:lang w:val="en-US"/>
         </w:rPr>
-        <w:t>(i) a</w:t>
+        <w:t>(</w:t>
+      </w:r>
+      <w:proofErr w:type="spellStart"/>
+      <w:r>
+        <w:rPr>
+          <w:lang w:val="en-US"/>
+        </w:rPr>
+        <w:t>i</w:t>
+      </w:r>
+      <w:proofErr w:type="spellEnd"/>
+      <w:r>
+        <w:rPr>
+          <w:lang w:val="en-US"/>
+        </w:rPr>
+        <w:t>) a</w:t>
       </w:r>
       <w:r>
         <w:rPr>
@@ -4978,7 +5114,21 @@
         <w:rPr>
           <w:lang w:val="en-US"/>
         </w:rPr>
-        <w:t>Ratios the results of a secondary reference material  by its “Real Value” which comes from the reference material file (.csv in RM_Files folder)</w:t>
+        <w:t xml:space="preserve">Ratios the results of a secondary reference material  by its “Real Value” which comes from the reference material file (.csv in </w:t>
+      </w:r>
+      <w:proofErr w:type="spellStart"/>
+      <w:r>
+        <w:rPr>
+          <w:lang w:val="en-US"/>
+        </w:rPr>
+        <w:t>RM_Files</w:t>
+      </w:r>
+      <w:proofErr w:type="spellEnd"/>
+      <w:r>
+        <w:rPr>
+          <w:lang w:val="en-US"/>
+        </w:rPr>
+        <w:t xml:space="preserve"> folder)</w:t>
       </w:r>
     </w:p>
     <w:p>

</xml_diff>